<commit_message>
Track B: N1 bridge and N4 forwarding table verified on hardware
</commit_message>
<xml_diff>
--- a/docs/mini_noc_network_integration_v0_4.docx
+++ b/docs/mini_noc_network_integration_v0_4.docx
@@ -3462,7 +3462,1455 @@
         <w:pStyle w:val="Heading1"/>
       </w:pPr>
       <w:r>
-        <w:t xml:space="preserve">25. Open Decisions</w:t>
+        <w:t xml:space="preserve">25. Stage N1: PS-PL Bridge</w:t>
+      </w:r>
+    </w:p>
+    <w:p>
+      <w:pPr>
+        <w:spacing w:after="120"/>
+      </w:pPr>
+      <w:r>
+        <w:rPr>
+          <w:rFonts w:ascii="Consolas" w:cs="Consolas" w:eastAsia="Consolas" w:hAnsi="Consolas"/>
+          <w:sz w:val="18"/>
+          <w:szCs w:val="18"/>
+        </w:rPr>
+        <w:t xml:space="preserve">rtl/axil_noc_bridge.sv</w:t>
+      </w:r>
+      <w:r>
+        <w:t xml:space="preserve"> is an AXI4-Lite slave that replaces the traffic generator on endpoint 0. The Zynq PS injects and receives flits by register access. Endpoints 1-7 keep their generators, so every PS transaction crosses a contended fabric. Generators never address endpoint 0; software must not send DATA to endpoints 1-7, and should use memory at or above byte 0x1000 (generators occupy words 32·ID to 32·ID+3).</w:t>
+      </w:r>
+    </w:p>
+    <w:tbl>
+      <w:tblPr>
+        <w:tblW w:type="dxa" w:w="10080"/>
+        <w:tblBorders>
+          <w:top w:val="single" w:color="auto" w:sz="4"/>
+          <w:left w:val="single" w:color="auto" w:sz="4"/>
+          <w:bottom w:val="single" w:color="auto" w:sz="4"/>
+          <w:right w:val="single" w:color="auto" w:sz="4"/>
+          <w:insideH w:val="single" w:color="auto" w:sz="4"/>
+          <w:insideV w:val="single" w:color="auto" w:sz="4"/>
+        </w:tblBorders>
+      </w:tblPr>
+      <w:tblGrid>
+        <w:gridCol w:w="995"/>
+        <w:gridCol w:w="1244"/>
+        <w:gridCol w:w="995"/>
+        <w:gridCol w:w="6846"/>
+      </w:tblGrid>
+      <w:tr>
+        <w:trPr>
+          <w:cantSplit/>
+          <w:tblHeader/>
+        </w:trPr>
+        <w:tc>
+          <w:tcPr>
+            <w:tcW w:type="dxa" w:w="995"/>
+            <w:tcBorders>
+              <w:top w:val="single" w:color="A6A6A6" w:sz="4"/>
+              <w:left w:val="single" w:color="A6A6A6" w:sz="4"/>
+              <w:bottom w:val="single" w:color="A6A6A6" w:sz="4"/>
+              <w:right w:val="single" w:color="A6A6A6" w:sz="4"/>
+            </w:tcBorders>
+            <w:shd w:fill="D9EAF7" w:color="auto" w:val="clear"/>
+            <w:tcMar>
+              <w:top w:type="dxa" w:w="90"/>
+              <w:left w:type="dxa" w:w="100"/>
+              <w:bottom w:type="dxa" w:w="90"/>
+              <w:right w:type="dxa" w:w="100"/>
+            </w:tcMar>
+            <w:vAlign w:val="center"/>
+          </w:tcPr>
+          <w:p>
+            <w:pPr>
+              <w:spacing w:after="0"/>
+            </w:pPr>
+            <w:r>
+              <w:rPr>
+                <w:b/>
+                <w:bCs/>
+              </w:rPr>
+              <w:t xml:space="preserve">Offset</w:t>
+            </w:r>
+          </w:p>
+        </w:tc>
+        <w:tc>
+          <w:tcPr>
+            <w:tcW w:type="dxa" w:w="1244"/>
+            <w:tcBorders>
+              <w:top w:val="single" w:color="A6A6A6" w:sz="4"/>
+              <w:left w:val="single" w:color="A6A6A6" w:sz="4"/>
+              <w:bottom w:val="single" w:color="A6A6A6" w:sz="4"/>
+              <w:right w:val="single" w:color="A6A6A6" w:sz="4"/>
+            </w:tcBorders>
+            <w:shd w:fill="D9EAF7" w:color="auto" w:val="clear"/>
+            <w:tcMar>
+              <w:top w:type="dxa" w:w="90"/>
+              <w:left w:type="dxa" w:w="100"/>
+              <w:bottom w:type="dxa" w:w="90"/>
+              <w:right w:type="dxa" w:w="100"/>
+            </w:tcMar>
+            <w:vAlign w:val="center"/>
+          </w:tcPr>
+          <w:p>
+            <w:pPr>
+              <w:spacing w:after="0"/>
+            </w:pPr>
+            <w:r>
+              <w:rPr>
+                <w:b/>
+                <w:bCs/>
+              </w:rPr>
+              <w:t xml:space="preserve">Name</w:t>
+            </w:r>
+          </w:p>
+        </w:tc>
+        <w:tc>
+          <w:tcPr>
+            <w:tcW w:type="dxa" w:w="995"/>
+            <w:tcBorders>
+              <w:top w:val="single" w:color="A6A6A6" w:sz="4"/>
+              <w:left w:val="single" w:color="A6A6A6" w:sz="4"/>
+              <w:bottom w:val="single" w:color="A6A6A6" w:sz="4"/>
+              <w:right w:val="single" w:color="A6A6A6" w:sz="4"/>
+            </w:tcBorders>
+            <w:shd w:fill="D9EAF7" w:color="auto" w:val="clear"/>
+            <w:tcMar>
+              <w:top w:type="dxa" w:w="90"/>
+              <w:left w:type="dxa" w:w="100"/>
+              <w:bottom w:type="dxa" w:w="90"/>
+              <w:right w:type="dxa" w:w="100"/>
+            </w:tcMar>
+            <w:vAlign w:val="center"/>
+          </w:tcPr>
+          <w:p>
+            <w:pPr>
+              <w:spacing w:after="0"/>
+            </w:pPr>
+            <w:r>
+              <w:rPr>
+                <w:b/>
+                <w:bCs/>
+              </w:rPr>
+              <w:t xml:space="preserve">Access</w:t>
+            </w:r>
+          </w:p>
+        </w:tc>
+        <w:tc>
+          <w:tcPr>
+            <w:tcW w:type="dxa" w:w="6846"/>
+            <w:tcBorders>
+              <w:top w:val="single" w:color="A6A6A6" w:sz="4"/>
+              <w:left w:val="single" w:color="A6A6A6" w:sz="4"/>
+              <w:bottom w:val="single" w:color="A6A6A6" w:sz="4"/>
+              <w:right w:val="single" w:color="A6A6A6" w:sz="4"/>
+            </w:tcBorders>
+            <w:shd w:fill="D9EAF7" w:color="auto" w:val="clear"/>
+            <w:tcMar>
+              <w:top w:type="dxa" w:w="90"/>
+              <w:left w:type="dxa" w:w="100"/>
+              <w:bottom w:type="dxa" w:w="90"/>
+              <w:right w:type="dxa" w:w="100"/>
+            </w:tcMar>
+            <w:vAlign w:val="center"/>
+          </w:tcPr>
+          <w:p>
+            <w:pPr>
+              <w:spacing w:after="0"/>
+            </w:pPr>
+            <w:r>
+              <w:rPr>
+                <w:b/>
+                <w:bCs/>
+              </w:rPr>
+              <w:t xml:space="preserve">Meaning</w:t>
+            </w:r>
+          </w:p>
+        </w:tc>
+      </w:tr>
+      <w:tr>
+        <w:trPr>
+          <w:cantSplit/>
+          <w:tblHeader w:val="false"/>
+        </w:trPr>
+        <w:tc>
+          <w:tcPr>
+            <w:tcW w:type="dxa" w:w="995"/>
+            <w:tcBorders>
+              <w:top w:val="single" w:color="A6A6A6" w:sz="4"/>
+              <w:left w:val="single" w:color="A6A6A6" w:sz="4"/>
+              <w:bottom w:val="single" w:color="A6A6A6" w:sz="4"/>
+              <w:right w:val="single" w:color="A6A6A6" w:sz="4"/>
+            </w:tcBorders>
+            <w:tcMar>
+              <w:top w:type="dxa" w:w="90"/>
+              <w:left w:type="dxa" w:w="100"/>
+              <w:bottom w:type="dxa" w:w="90"/>
+              <w:right w:type="dxa" w:w="100"/>
+            </w:tcMar>
+            <w:vAlign w:val="center"/>
+          </w:tcPr>
+          <w:p>
+            <w:pPr>
+              <w:spacing w:after="0"/>
+            </w:pPr>
+            <w:r>
+              <w:t xml:space="preserve">0x00</w:t>
+            </w:r>
+          </w:p>
+        </w:tc>
+        <w:tc>
+          <w:tcPr>
+            <w:tcW w:type="dxa" w:w="1244"/>
+            <w:tcBorders>
+              <w:top w:val="single" w:color="A6A6A6" w:sz="4"/>
+              <w:left w:val="single" w:color="A6A6A6" w:sz="4"/>
+              <w:bottom w:val="single" w:color="A6A6A6" w:sz="4"/>
+              <w:right w:val="single" w:color="A6A6A6" w:sz="4"/>
+            </w:tcBorders>
+            <w:tcMar>
+              <w:top w:type="dxa" w:w="90"/>
+              <w:left w:type="dxa" w:w="100"/>
+              <w:bottom w:type="dxa" w:w="90"/>
+              <w:right w:type="dxa" w:w="100"/>
+            </w:tcMar>
+            <w:vAlign w:val="center"/>
+          </w:tcPr>
+          <w:p>
+            <w:pPr>
+              <w:spacing w:after="0"/>
+            </w:pPr>
+            <w:r>
+              <w:t xml:space="preserve">ID</w:t>
+            </w:r>
+          </w:p>
+        </w:tc>
+        <w:tc>
+          <w:tcPr>
+            <w:tcW w:type="dxa" w:w="995"/>
+            <w:tcBorders>
+              <w:top w:val="single" w:color="A6A6A6" w:sz="4"/>
+              <w:left w:val="single" w:color="A6A6A6" w:sz="4"/>
+              <w:bottom w:val="single" w:color="A6A6A6" w:sz="4"/>
+              <w:right w:val="single" w:color="A6A6A6" w:sz="4"/>
+            </w:tcBorders>
+            <w:tcMar>
+              <w:top w:type="dxa" w:w="90"/>
+              <w:left w:type="dxa" w:w="100"/>
+              <w:bottom w:type="dxa" w:w="90"/>
+              <w:right w:type="dxa" w:w="100"/>
+            </w:tcMar>
+            <w:vAlign w:val="center"/>
+          </w:tcPr>
+          <w:p>
+            <w:pPr>
+              <w:spacing w:after="0"/>
+            </w:pPr>
+            <w:r>
+              <w:t xml:space="preserve">RO</w:t>
+            </w:r>
+          </w:p>
+        </w:tc>
+        <w:tc>
+          <w:tcPr>
+            <w:tcW w:type="dxa" w:w="6846"/>
+            <w:tcBorders>
+              <w:top w:val="single" w:color="A6A6A6" w:sz="4"/>
+              <w:left w:val="single" w:color="A6A6A6" w:sz="4"/>
+              <w:bottom w:val="single" w:color="A6A6A6" w:sz="4"/>
+              <w:right w:val="single" w:color="A6A6A6" w:sz="4"/>
+            </w:tcBorders>
+            <w:tcMar>
+              <w:top w:type="dxa" w:w="90"/>
+              <w:left w:type="dxa" w:w="100"/>
+              <w:bottom w:type="dxa" w:w="90"/>
+              <w:right w:type="dxa" w:w="100"/>
+            </w:tcMar>
+            <w:vAlign w:val="center"/>
+          </w:tcPr>
+          <w:p>
+            <w:pPr>
+              <w:spacing w:after="0"/>
+            </w:pPr>
+            <w:r>
+              <w:t xml:space="preserve">0x4E4F4331 ("NOC1")</w:t>
+            </w:r>
+          </w:p>
+        </w:tc>
+      </w:tr>
+      <w:tr>
+        <w:trPr>
+          <w:cantSplit/>
+          <w:tblHeader w:val="false"/>
+        </w:trPr>
+        <w:tc>
+          <w:tcPr>
+            <w:tcW w:type="dxa" w:w="995"/>
+            <w:tcBorders>
+              <w:top w:val="single" w:color="A6A6A6" w:sz="4"/>
+              <w:left w:val="single" w:color="A6A6A6" w:sz="4"/>
+              <w:bottom w:val="single" w:color="A6A6A6" w:sz="4"/>
+              <w:right w:val="single" w:color="A6A6A6" w:sz="4"/>
+            </w:tcBorders>
+            <w:tcMar>
+              <w:top w:type="dxa" w:w="90"/>
+              <w:left w:type="dxa" w:w="100"/>
+              <w:bottom w:type="dxa" w:w="90"/>
+              <w:right w:type="dxa" w:w="100"/>
+            </w:tcMar>
+            <w:vAlign w:val="center"/>
+          </w:tcPr>
+          <w:p>
+            <w:pPr>
+              <w:spacing w:after="0"/>
+            </w:pPr>
+            <w:r>
+              <w:t xml:space="preserve">0x04</w:t>
+            </w:r>
+          </w:p>
+        </w:tc>
+        <w:tc>
+          <w:tcPr>
+            <w:tcW w:type="dxa" w:w="1244"/>
+            <w:tcBorders>
+              <w:top w:val="single" w:color="A6A6A6" w:sz="4"/>
+              <w:left w:val="single" w:color="A6A6A6" w:sz="4"/>
+              <w:bottom w:val="single" w:color="A6A6A6" w:sz="4"/>
+              <w:right w:val="single" w:color="A6A6A6" w:sz="4"/>
+            </w:tcBorders>
+            <w:tcMar>
+              <w:top w:type="dxa" w:w="90"/>
+              <w:left w:type="dxa" w:w="100"/>
+              <w:bottom w:type="dxa" w:w="90"/>
+              <w:right w:type="dxa" w:w="100"/>
+            </w:tcMar>
+            <w:vAlign w:val="center"/>
+          </w:tcPr>
+          <w:p>
+            <w:pPr>
+              <w:spacing w:after="0"/>
+            </w:pPr>
+            <w:r>
+              <w:t xml:space="preserve">STATUS</w:t>
+            </w:r>
+          </w:p>
+        </w:tc>
+        <w:tc>
+          <w:tcPr>
+            <w:tcW w:type="dxa" w:w="995"/>
+            <w:tcBorders>
+              <w:top w:val="single" w:color="A6A6A6" w:sz="4"/>
+              <w:left w:val="single" w:color="A6A6A6" w:sz="4"/>
+              <w:bottom w:val="single" w:color="A6A6A6" w:sz="4"/>
+              <w:right w:val="single" w:color="A6A6A6" w:sz="4"/>
+            </w:tcBorders>
+            <w:tcMar>
+              <w:top w:type="dxa" w:w="90"/>
+              <w:left w:type="dxa" w:w="100"/>
+              <w:bottom w:type="dxa" w:w="90"/>
+              <w:right w:type="dxa" w:w="100"/>
+            </w:tcMar>
+            <w:vAlign w:val="center"/>
+          </w:tcPr>
+          <w:p>
+            <w:pPr>
+              <w:spacing w:after="0"/>
+            </w:pPr>
+            <w:r>
+              <w:t xml:space="preserve">RO</w:t>
+            </w:r>
+          </w:p>
+        </w:tc>
+        <w:tc>
+          <w:tcPr>
+            <w:tcW w:type="dxa" w:w="6846"/>
+            <w:tcBorders>
+              <w:top w:val="single" w:color="A6A6A6" w:sz="4"/>
+              <w:left w:val="single" w:color="A6A6A6" w:sz="4"/>
+              <w:bottom w:val="single" w:color="A6A6A6" w:sz="4"/>
+              <w:right w:val="single" w:color="A6A6A6" w:sz="4"/>
+            </w:tcBorders>
+            <w:tcMar>
+              <w:top w:type="dxa" w:w="90"/>
+              <w:left w:type="dxa" w:w="100"/>
+              <w:bottom w:type="dxa" w:w="90"/>
+              <w:right w:type="dxa" w:w="100"/>
+            </w:tcMar>
+            <w:vAlign w:val="center"/>
+          </w:tcPr>
+          <w:p>
+            <w:pPr>
+              <w:spacing w:after="0"/>
+            </w:pPr>
+            <w:r>
+              <w:t xml:space="preserve">[0] tx_space, [1] rx_avail, [2] rx_sop, [3] rx_eop, [15:8] rx_count, [23:16] tx_count</w:t>
+            </w:r>
+          </w:p>
+        </w:tc>
+      </w:tr>
+      <w:tr>
+        <w:trPr>
+          <w:cantSplit/>
+          <w:tblHeader w:val="false"/>
+        </w:trPr>
+        <w:tc>
+          <w:tcPr>
+            <w:tcW w:type="dxa" w:w="995"/>
+            <w:tcBorders>
+              <w:top w:val="single" w:color="A6A6A6" w:sz="4"/>
+              <w:left w:val="single" w:color="A6A6A6" w:sz="4"/>
+              <w:bottom w:val="single" w:color="A6A6A6" w:sz="4"/>
+              <w:right w:val="single" w:color="A6A6A6" w:sz="4"/>
+            </w:tcBorders>
+            <w:tcMar>
+              <w:top w:type="dxa" w:w="90"/>
+              <w:left w:type="dxa" w:w="100"/>
+              <w:bottom w:type="dxa" w:w="90"/>
+              <w:right w:type="dxa" w:w="100"/>
+            </w:tcMar>
+            <w:vAlign w:val="center"/>
+          </w:tcPr>
+          <w:p>
+            <w:pPr>
+              <w:spacing w:after="0"/>
+            </w:pPr>
+            <w:r>
+              <w:t xml:space="preserve">0x08</w:t>
+            </w:r>
+          </w:p>
+        </w:tc>
+        <w:tc>
+          <w:tcPr>
+            <w:tcW w:type="dxa" w:w="1244"/>
+            <w:tcBorders>
+              <w:top w:val="single" w:color="A6A6A6" w:sz="4"/>
+              <w:left w:val="single" w:color="A6A6A6" w:sz="4"/>
+              <w:bottom w:val="single" w:color="A6A6A6" w:sz="4"/>
+              <w:right w:val="single" w:color="A6A6A6" w:sz="4"/>
+            </w:tcBorders>
+            <w:tcMar>
+              <w:top w:type="dxa" w:w="90"/>
+              <w:left w:type="dxa" w:w="100"/>
+              <w:bottom w:type="dxa" w:w="90"/>
+              <w:right w:type="dxa" w:w="100"/>
+            </w:tcMar>
+            <w:vAlign w:val="center"/>
+          </w:tcPr>
+          <w:p>
+            <w:pPr>
+              <w:spacing w:after="0"/>
+            </w:pPr>
+            <w:r>
+              <w:t xml:space="preserve">TX_LO</w:t>
+            </w:r>
+          </w:p>
+        </w:tc>
+        <w:tc>
+          <w:tcPr>
+            <w:tcW w:type="dxa" w:w="995"/>
+            <w:tcBorders>
+              <w:top w:val="single" w:color="A6A6A6" w:sz="4"/>
+              <w:left w:val="single" w:color="A6A6A6" w:sz="4"/>
+              <w:bottom w:val="single" w:color="A6A6A6" w:sz="4"/>
+              <w:right w:val="single" w:color="A6A6A6" w:sz="4"/>
+            </w:tcBorders>
+            <w:tcMar>
+              <w:top w:type="dxa" w:w="90"/>
+              <w:left w:type="dxa" w:w="100"/>
+              <w:bottom w:type="dxa" w:w="90"/>
+              <w:right w:type="dxa" w:w="100"/>
+            </w:tcMar>
+            <w:vAlign w:val="center"/>
+          </w:tcPr>
+          <w:p>
+            <w:pPr>
+              <w:spacing w:after="0"/>
+            </w:pPr>
+            <w:r>
+              <w:t xml:space="preserve">RW</w:t>
+            </w:r>
+          </w:p>
+        </w:tc>
+        <w:tc>
+          <w:tcPr>
+            <w:tcW w:type="dxa" w:w="6846"/>
+            <w:tcBorders>
+              <w:top w:val="single" w:color="A6A6A6" w:sz="4"/>
+              <w:left w:val="single" w:color="A6A6A6" w:sz="4"/>
+              <w:bottom w:val="single" w:color="A6A6A6" w:sz="4"/>
+              <w:right w:val="single" w:color="A6A6A6" w:sz="4"/>
+            </w:tcBorders>
+            <w:tcMar>
+              <w:top w:type="dxa" w:w="90"/>
+              <w:left w:type="dxa" w:w="100"/>
+              <w:bottom w:type="dxa" w:w="90"/>
+              <w:right w:type="dxa" w:w="100"/>
+            </w:tcMar>
+            <w:vAlign w:val="center"/>
+          </w:tcPr>
+          <w:p>
+            <w:pPr>
+              <w:spacing w:after="0"/>
+            </w:pPr>
+            <w:r>
+              <w:t xml:space="preserve">Staged flit bits [31:0]</w:t>
+            </w:r>
+          </w:p>
+        </w:tc>
+      </w:tr>
+      <w:tr>
+        <w:trPr>
+          <w:cantSplit/>
+          <w:tblHeader w:val="false"/>
+        </w:trPr>
+        <w:tc>
+          <w:tcPr>
+            <w:tcW w:type="dxa" w:w="995"/>
+            <w:tcBorders>
+              <w:top w:val="single" w:color="A6A6A6" w:sz="4"/>
+              <w:left w:val="single" w:color="A6A6A6" w:sz="4"/>
+              <w:bottom w:val="single" w:color="A6A6A6" w:sz="4"/>
+              <w:right w:val="single" w:color="A6A6A6" w:sz="4"/>
+            </w:tcBorders>
+            <w:tcMar>
+              <w:top w:type="dxa" w:w="90"/>
+              <w:left w:type="dxa" w:w="100"/>
+              <w:bottom w:type="dxa" w:w="90"/>
+              <w:right w:type="dxa" w:w="100"/>
+            </w:tcMar>
+            <w:vAlign w:val="center"/>
+          </w:tcPr>
+          <w:p>
+            <w:pPr>
+              <w:spacing w:after="0"/>
+            </w:pPr>
+            <w:r>
+              <w:t xml:space="preserve">0x0C</w:t>
+            </w:r>
+          </w:p>
+        </w:tc>
+        <w:tc>
+          <w:tcPr>
+            <w:tcW w:type="dxa" w:w="1244"/>
+            <w:tcBorders>
+              <w:top w:val="single" w:color="A6A6A6" w:sz="4"/>
+              <w:left w:val="single" w:color="A6A6A6" w:sz="4"/>
+              <w:bottom w:val="single" w:color="A6A6A6" w:sz="4"/>
+              <w:right w:val="single" w:color="A6A6A6" w:sz="4"/>
+            </w:tcBorders>
+            <w:tcMar>
+              <w:top w:type="dxa" w:w="90"/>
+              <w:left w:type="dxa" w:w="100"/>
+              <w:bottom w:type="dxa" w:w="90"/>
+              <w:right w:type="dxa" w:w="100"/>
+            </w:tcMar>
+            <w:vAlign w:val="center"/>
+          </w:tcPr>
+          <w:p>
+            <w:pPr>
+              <w:spacing w:after="0"/>
+            </w:pPr>
+            <w:r>
+              <w:t xml:space="preserve">TX_HI</w:t>
+            </w:r>
+          </w:p>
+        </w:tc>
+        <w:tc>
+          <w:tcPr>
+            <w:tcW w:type="dxa" w:w="995"/>
+            <w:tcBorders>
+              <w:top w:val="single" w:color="A6A6A6" w:sz="4"/>
+              <w:left w:val="single" w:color="A6A6A6" w:sz="4"/>
+              <w:bottom w:val="single" w:color="A6A6A6" w:sz="4"/>
+              <w:right w:val="single" w:color="A6A6A6" w:sz="4"/>
+            </w:tcBorders>
+            <w:tcMar>
+              <w:top w:type="dxa" w:w="90"/>
+              <w:left w:type="dxa" w:w="100"/>
+              <w:bottom w:type="dxa" w:w="90"/>
+              <w:right w:type="dxa" w:w="100"/>
+            </w:tcMar>
+            <w:vAlign w:val="center"/>
+          </w:tcPr>
+          <w:p>
+            <w:pPr>
+              <w:spacing w:after="0"/>
+            </w:pPr>
+            <w:r>
+              <w:t xml:space="preserve">RW</w:t>
+            </w:r>
+          </w:p>
+        </w:tc>
+        <w:tc>
+          <w:tcPr>
+            <w:tcW w:type="dxa" w:w="6846"/>
+            <w:tcBorders>
+              <w:top w:val="single" w:color="A6A6A6" w:sz="4"/>
+              <w:left w:val="single" w:color="A6A6A6" w:sz="4"/>
+              <w:bottom w:val="single" w:color="A6A6A6" w:sz="4"/>
+              <w:right w:val="single" w:color="A6A6A6" w:sz="4"/>
+            </w:tcBorders>
+            <w:tcMar>
+              <w:top w:type="dxa" w:w="90"/>
+              <w:left w:type="dxa" w:w="100"/>
+              <w:bottom w:type="dxa" w:w="90"/>
+              <w:right w:type="dxa" w:w="100"/>
+            </w:tcMar>
+            <w:vAlign w:val="center"/>
+          </w:tcPr>
+          <w:p>
+            <w:pPr>
+              <w:spacing w:after="0"/>
+            </w:pPr>
+            <w:r>
+              <w:t xml:space="preserve">Staged flit bits [63:32]</w:t>
+            </w:r>
+          </w:p>
+        </w:tc>
+      </w:tr>
+      <w:tr>
+        <w:trPr>
+          <w:cantSplit/>
+          <w:tblHeader w:val="false"/>
+        </w:trPr>
+        <w:tc>
+          <w:tcPr>
+            <w:tcW w:type="dxa" w:w="995"/>
+            <w:tcBorders>
+              <w:top w:val="single" w:color="A6A6A6" w:sz="4"/>
+              <w:left w:val="single" w:color="A6A6A6" w:sz="4"/>
+              <w:bottom w:val="single" w:color="A6A6A6" w:sz="4"/>
+              <w:right w:val="single" w:color="A6A6A6" w:sz="4"/>
+            </w:tcBorders>
+            <w:tcMar>
+              <w:top w:type="dxa" w:w="90"/>
+              <w:left w:type="dxa" w:w="100"/>
+              <w:bottom w:type="dxa" w:w="90"/>
+              <w:right w:type="dxa" w:w="100"/>
+            </w:tcMar>
+            <w:vAlign w:val="center"/>
+          </w:tcPr>
+          <w:p>
+            <w:pPr>
+              <w:spacing w:after="0"/>
+            </w:pPr>
+            <w:r>
+              <w:t xml:space="preserve">0x10</w:t>
+            </w:r>
+          </w:p>
+        </w:tc>
+        <w:tc>
+          <w:tcPr>
+            <w:tcW w:type="dxa" w:w="1244"/>
+            <w:tcBorders>
+              <w:top w:val="single" w:color="A6A6A6" w:sz="4"/>
+              <w:left w:val="single" w:color="A6A6A6" w:sz="4"/>
+              <w:bottom w:val="single" w:color="A6A6A6" w:sz="4"/>
+              <w:right w:val="single" w:color="A6A6A6" w:sz="4"/>
+            </w:tcBorders>
+            <w:tcMar>
+              <w:top w:type="dxa" w:w="90"/>
+              <w:left w:type="dxa" w:w="100"/>
+              <w:bottom w:type="dxa" w:w="90"/>
+              <w:right w:type="dxa" w:w="100"/>
+            </w:tcMar>
+            <w:vAlign w:val="center"/>
+          </w:tcPr>
+          <w:p>
+            <w:pPr>
+              <w:spacing w:after="0"/>
+            </w:pPr>
+            <w:r>
+              <w:t xml:space="preserve">TX_PUSH</w:t>
+            </w:r>
+          </w:p>
+        </w:tc>
+        <w:tc>
+          <w:tcPr>
+            <w:tcW w:type="dxa" w:w="995"/>
+            <w:tcBorders>
+              <w:top w:val="single" w:color="A6A6A6" w:sz="4"/>
+              <w:left w:val="single" w:color="A6A6A6" w:sz="4"/>
+              <w:bottom w:val="single" w:color="A6A6A6" w:sz="4"/>
+              <w:right w:val="single" w:color="A6A6A6" w:sz="4"/>
+            </w:tcBorders>
+            <w:tcMar>
+              <w:top w:type="dxa" w:w="90"/>
+              <w:left w:type="dxa" w:w="100"/>
+              <w:bottom w:type="dxa" w:w="90"/>
+              <w:right w:type="dxa" w:w="100"/>
+            </w:tcMar>
+            <w:vAlign w:val="center"/>
+          </w:tcPr>
+          <w:p>
+            <w:pPr>
+              <w:spacing w:after="0"/>
+            </w:pPr>
+            <w:r>
+              <w:t xml:space="preserve">WO</w:t>
+            </w:r>
+          </w:p>
+        </w:tc>
+        <w:tc>
+          <w:tcPr>
+            <w:tcW w:type="dxa" w:w="6846"/>
+            <w:tcBorders>
+              <w:top w:val="single" w:color="A6A6A6" w:sz="4"/>
+              <w:left w:val="single" w:color="A6A6A6" w:sz="4"/>
+              <w:bottom w:val="single" w:color="A6A6A6" w:sz="4"/>
+              <w:right w:val="single" w:color="A6A6A6" w:sz="4"/>
+            </w:tcBorders>
+            <w:tcMar>
+              <w:top w:type="dxa" w:w="90"/>
+              <w:left w:type="dxa" w:w="100"/>
+              <w:bottom w:type="dxa" w:w="90"/>
+              <w:right w:type="dxa" w:w="100"/>
+            </w:tcMar>
+            <w:vAlign w:val="center"/>
+          </w:tcPr>
+          <w:p>
+            <w:pPr>
+              <w:spacing w:after="0"/>
+            </w:pPr>
+            <w:r>
+              <w:t xml:space="preserve">[0] sop, [1] eop; pushes the staged flit, or counts a drop if full</w:t>
+            </w:r>
+          </w:p>
+        </w:tc>
+      </w:tr>
+      <w:tr>
+        <w:trPr>
+          <w:cantSplit/>
+          <w:tblHeader w:val="false"/>
+        </w:trPr>
+        <w:tc>
+          <w:tcPr>
+            <w:tcW w:type="dxa" w:w="995"/>
+            <w:tcBorders>
+              <w:top w:val="single" w:color="A6A6A6" w:sz="4"/>
+              <w:left w:val="single" w:color="A6A6A6" w:sz="4"/>
+              <w:bottom w:val="single" w:color="A6A6A6" w:sz="4"/>
+              <w:right w:val="single" w:color="A6A6A6" w:sz="4"/>
+            </w:tcBorders>
+            <w:tcMar>
+              <w:top w:type="dxa" w:w="90"/>
+              <w:left w:type="dxa" w:w="100"/>
+              <w:bottom w:type="dxa" w:w="90"/>
+              <w:right w:type="dxa" w:w="100"/>
+            </w:tcMar>
+            <w:vAlign w:val="center"/>
+          </w:tcPr>
+          <w:p>
+            <w:pPr>
+              <w:spacing w:after="0"/>
+            </w:pPr>
+            <w:r>
+              <w:t xml:space="preserve">0x14</w:t>
+            </w:r>
+          </w:p>
+        </w:tc>
+        <w:tc>
+          <w:tcPr>
+            <w:tcW w:type="dxa" w:w="1244"/>
+            <w:tcBorders>
+              <w:top w:val="single" w:color="A6A6A6" w:sz="4"/>
+              <w:left w:val="single" w:color="A6A6A6" w:sz="4"/>
+              <w:bottom w:val="single" w:color="A6A6A6" w:sz="4"/>
+              <w:right w:val="single" w:color="A6A6A6" w:sz="4"/>
+            </w:tcBorders>
+            <w:tcMar>
+              <w:top w:type="dxa" w:w="90"/>
+              <w:left w:type="dxa" w:w="100"/>
+              <w:bottom w:type="dxa" w:w="90"/>
+              <w:right w:type="dxa" w:w="100"/>
+            </w:tcMar>
+            <w:vAlign w:val="center"/>
+          </w:tcPr>
+          <w:p>
+            <w:pPr>
+              <w:spacing w:after="0"/>
+            </w:pPr>
+            <w:r>
+              <w:t xml:space="preserve">RX_LO</w:t>
+            </w:r>
+          </w:p>
+        </w:tc>
+        <w:tc>
+          <w:tcPr>
+            <w:tcW w:type="dxa" w:w="995"/>
+            <w:tcBorders>
+              <w:top w:val="single" w:color="A6A6A6" w:sz="4"/>
+              <w:left w:val="single" w:color="A6A6A6" w:sz="4"/>
+              <w:bottom w:val="single" w:color="A6A6A6" w:sz="4"/>
+              <w:right w:val="single" w:color="A6A6A6" w:sz="4"/>
+            </w:tcBorders>
+            <w:tcMar>
+              <w:top w:type="dxa" w:w="90"/>
+              <w:left w:type="dxa" w:w="100"/>
+              <w:bottom w:type="dxa" w:w="90"/>
+              <w:right w:type="dxa" w:w="100"/>
+            </w:tcMar>
+            <w:vAlign w:val="center"/>
+          </w:tcPr>
+          <w:p>
+            <w:pPr>
+              <w:spacing w:after="0"/>
+            </w:pPr>
+            <w:r>
+              <w:t xml:space="preserve">RO</w:t>
+            </w:r>
+          </w:p>
+        </w:tc>
+        <w:tc>
+          <w:tcPr>
+            <w:tcW w:type="dxa" w:w="6846"/>
+            <w:tcBorders>
+              <w:top w:val="single" w:color="A6A6A6" w:sz="4"/>
+              <w:left w:val="single" w:color="A6A6A6" w:sz="4"/>
+              <w:bottom w:val="single" w:color="A6A6A6" w:sz="4"/>
+              <w:right w:val="single" w:color="A6A6A6" w:sz="4"/>
+            </w:tcBorders>
+            <w:tcMar>
+              <w:top w:type="dxa" w:w="90"/>
+              <w:left w:type="dxa" w:w="100"/>
+              <w:bottom w:type="dxa" w:w="90"/>
+              <w:right w:type="dxa" w:w="100"/>
+            </w:tcMar>
+            <w:vAlign w:val="center"/>
+          </w:tcPr>
+          <w:p>
+            <w:pPr>
+              <w:spacing w:after="0"/>
+            </w:pPr>
+            <w:r>
+              <w:t xml:space="preserve">Head flit bits [31:0], no side effect</w:t>
+            </w:r>
+          </w:p>
+        </w:tc>
+      </w:tr>
+      <w:tr>
+        <w:trPr>
+          <w:cantSplit/>
+          <w:tblHeader w:val="false"/>
+        </w:trPr>
+        <w:tc>
+          <w:tcPr>
+            <w:tcW w:type="dxa" w:w="995"/>
+            <w:tcBorders>
+              <w:top w:val="single" w:color="A6A6A6" w:sz="4"/>
+              <w:left w:val="single" w:color="A6A6A6" w:sz="4"/>
+              <w:bottom w:val="single" w:color="A6A6A6" w:sz="4"/>
+              <w:right w:val="single" w:color="A6A6A6" w:sz="4"/>
+            </w:tcBorders>
+            <w:tcMar>
+              <w:top w:type="dxa" w:w="90"/>
+              <w:left w:type="dxa" w:w="100"/>
+              <w:bottom w:type="dxa" w:w="90"/>
+              <w:right w:type="dxa" w:w="100"/>
+            </w:tcMar>
+            <w:vAlign w:val="center"/>
+          </w:tcPr>
+          <w:p>
+            <w:pPr>
+              <w:spacing w:after="0"/>
+            </w:pPr>
+            <w:r>
+              <w:t xml:space="preserve">0x18</w:t>
+            </w:r>
+          </w:p>
+        </w:tc>
+        <w:tc>
+          <w:tcPr>
+            <w:tcW w:type="dxa" w:w="1244"/>
+            <w:tcBorders>
+              <w:top w:val="single" w:color="A6A6A6" w:sz="4"/>
+              <w:left w:val="single" w:color="A6A6A6" w:sz="4"/>
+              <w:bottom w:val="single" w:color="A6A6A6" w:sz="4"/>
+              <w:right w:val="single" w:color="A6A6A6" w:sz="4"/>
+            </w:tcBorders>
+            <w:tcMar>
+              <w:top w:type="dxa" w:w="90"/>
+              <w:left w:type="dxa" w:w="100"/>
+              <w:bottom w:type="dxa" w:w="90"/>
+              <w:right w:type="dxa" w:w="100"/>
+            </w:tcMar>
+            <w:vAlign w:val="center"/>
+          </w:tcPr>
+          <w:p>
+            <w:pPr>
+              <w:spacing w:after="0"/>
+            </w:pPr>
+            <w:r>
+              <w:t xml:space="preserve">RX_HI</w:t>
+            </w:r>
+          </w:p>
+        </w:tc>
+        <w:tc>
+          <w:tcPr>
+            <w:tcW w:type="dxa" w:w="995"/>
+            <w:tcBorders>
+              <w:top w:val="single" w:color="A6A6A6" w:sz="4"/>
+              <w:left w:val="single" w:color="A6A6A6" w:sz="4"/>
+              <w:bottom w:val="single" w:color="A6A6A6" w:sz="4"/>
+              <w:right w:val="single" w:color="A6A6A6" w:sz="4"/>
+            </w:tcBorders>
+            <w:tcMar>
+              <w:top w:type="dxa" w:w="90"/>
+              <w:left w:type="dxa" w:w="100"/>
+              <w:bottom w:type="dxa" w:w="90"/>
+              <w:right w:type="dxa" w:w="100"/>
+            </w:tcMar>
+            <w:vAlign w:val="center"/>
+          </w:tcPr>
+          <w:p>
+            <w:pPr>
+              <w:spacing w:after="0"/>
+            </w:pPr>
+            <w:r>
+              <w:t xml:space="preserve">RO</w:t>
+            </w:r>
+          </w:p>
+        </w:tc>
+        <w:tc>
+          <w:tcPr>
+            <w:tcW w:type="dxa" w:w="6846"/>
+            <w:tcBorders>
+              <w:top w:val="single" w:color="A6A6A6" w:sz="4"/>
+              <w:left w:val="single" w:color="A6A6A6" w:sz="4"/>
+              <w:bottom w:val="single" w:color="A6A6A6" w:sz="4"/>
+              <w:right w:val="single" w:color="A6A6A6" w:sz="4"/>
+            </w:tcBorders>
+            <w:tcMar>
+              <w:top w:type="dxa" w:w="90"/>
+              <w:left w:type="dxa" w:w="100"/>
+              <w:bottom w:type="dxa" w:w="90"/>
+              <w:right w:type="dxa" w:w="100"/>
+            </w:tcMar>
+            <w:vAlign w:val="center"/>
+          </w:tcPr>
+          <w:p>
+            <w:pPr>
+              <w:spacing w:after="0"/>
+            </w:pPr>
+            <w:r>
+              <w:t xml:space="preserve">Head flit bits [63:32], no side effect</w:t>
+            </w:r>
+          </w:p>
+        </w:tc>
+      </w:tr>
+      <w:tr>
+        <w:trPr>
+          <w:cantSplit/>
+          <w:tblHeader w:val="false"/>
+        </w:trPr>
+        <w:tc>
+          <w:tcPr>
+            <w:tcW w:type="dxa" w:w="995"/>
+            <w:tcBorders>
+              <w:top w:val="single" w:color="A6A6A6" w:sz="4"/>
+              <w:left w:val="single" w:color="A6A6A6" w:sz="4"/>
+              <w:bottom w:val="single" w:color="A6A6A6" w:sz="4"/>
+              <w:right w:val="single" w:color="A6A6A6" w:sz="4"/>
+            </w:tcBorders>
+            <w:tcMar>
+              <w:top w:type="dxa" w:w="90"/>
+              <w:left w:type="dxa" w:w="100"/>
+              <w:bottom w:type="dxa" w:w="90"/>
+              <w:right w:type="dxa" w:w="100"/>
+            </w:tcMar>
+            <w:vAlign w:val="center"/>
+          </w:tcPr>
+          <w:p>
+            <w:pPr>
+              <w:spacing w:after="0"/>
+            </w:pPr>
+            <w:r>
+              <w:t xml:space="preserve">0x1C</w:t>
+            </w:r>
+          </w:p>
+        </w:tc>
+        <w:tc>
+          <w:tcPr>
+            <w:tcW w:type="dxa" w:w="1244"/>
+            <w:tcBorders>
+              <w:top w:val="single" w:color="A6A6A6" w:sz="4"/>
+              <w:left w:val="single" w:color="A6A6A6" w:sz="4"/>
+              <w:bottom w:val="single" w:color="A6A6A6" w:sz="4"/>
+              <w:right w:val="single" w:color="A6A6A6" w:sz="4"/>
+            </w:tcBorders>
+            <w:tcMar>
+              <w:top w:type="dxa" w:w="90"/>
+              <w:left w:type="dxa" w:w="100"/>
+              <w:bottom w:type="dxa" w:w="90"/>
+              <w:right w:type="dxa" w:w="100"/>
+            </w:tcMar>
+            <w:vAlign w:val="center"/>
+          </w:tcPr>
+          <w:p>
+            <w:pPr>
+              <w:spacing w:after="0"/>
+            </w:pPr>
+            <w:r>
+              <w:t xml:space="preserve">RX_POP</w:t>
+            </w:r>
+          </w:p>
+        </w:tc>
+        <w:tc>
+          <w:tcPr>
+            <w:tcW w:type="dxa" w:w="995"/>
+            <w:tcBorders>
+              <w:top w:val="single" w:color="A6A6A6" w:sz="4"/>
+              <w:left w:val="single" w:color="A6A6A6" w:sz="4"/>
+              <w:bottom w:val="single" w:color="A6A6A6" w:sz="4"/>
+              <w:right w:val="single" w:color="A6A6A6" w:sz="4"/>
+            </w:tcBorders>
+            <w:tcMar>
+              <w:top w:type="dxa" w:w="90"/>
+              <w:left w:type="dxa" w:w="100"/>
+              <w:bottom w:type="dxa" w:w="90"/>
+              <w:right w:type="dxa" w:w="100"/>
+            </w:tcMar>
+            <w:vAlign w:val="center"/>
+          </w:tcPr>
+          <w:p>
+            <w:pPr>
+              <w:spacing w:after="0"/>
+            </w:pPr>
+            <w:r>
+              <w:t xml:space="preserve">WO</w:t>
+            </w:r>
+          </w:p>
+        </w:tc>
+        <w:tc>
+          <w:tcPr>
+            <w:tcW w:type="dxa" w:w="6846"/>
+            <w:tcBorders>
+              <w:top w:val="single" w:color="A6A6A6" w:sz="4"/>
+              <w:left w:val="single" w:color="A6A6A6" w:sz="4"/>
+              <w:bottom w:val="single" w:color="A6A6A6" w:sz="4"/>
+              <w:right w:val="single" w:color="A6A6A6" w:sz="4"/>
+            </w:tcBorders>
+            <w:tcMar>
+              <w:top w:type="dxa" w:w="90"/>
+              <w:left w:type="dxa" w:w="100"/>
+              <w:bottom w:type="dxa" w:w="90"/>
+              <w:right w:type="dxa" w:w="100"/>
+            </w:tcMar>
+            <w:vAlign w:val="center"/>
+          </w:tcPr>
+          <w:p>
+            <w:pPr>
+              <w:spacing w:after="0"/>
+            </w:pPr>
+            <w:r>
+              <w:t xml:space="preserve">Any value discards the head flit</w:t>
+            </w:r>
+          </w:p>
+        </w:tc>
+      </w:tr>
+      <w:tr>
+        <w:trPr>
+          <w:cantSplit/>
+          <w:tblHeader w:val="false"/>
+        </w:trPr>
+        <w:tc>
+          <w:tcPr>
+            <w:tcW w:type="dxa" w:w="995"/>
+            <w:tcBorders>
+              <w:top w:val="single" w:color="A6A6A6" w:sz="4"/>
+              <w:left w:val="single" w:color="A6A6A6" w:sz="4"/>
+              <w:bottom w:val="single" w:color="A6A6A6" w:sz="4"/>
+              <w:right w:val="single" w:color="A6A6A6" w:sz="4"/>
+            </w:tcBorders>
+            <w:tcMar>
+              <w:top w:type="dxa" w:w="90"/>
+              <w:left w:type="dxa" w:w="100"/>
+              <w:bottom w:type="dxa" w:w="90"/>
+              <w:right w:type="dxa" w:w="100"/>
+            </w:tcMar>
+            <w:vAlign w:val="center"/>
+          </w:tcPr>
+          <w:p>
+            <w:pPr>
+              <w:spacing w:after="0"/>
+            </w:pPr>
+            <w:r>
+              <w:t xml:space="preserve">0x20</w:t>
+            </w:r>
+          </w:p>
+        </w:tc>
+        <w:tc>
+          <w:tcPr>
+            <w:tcW w:type="dxa" w:w="1244"/>
+            <w:tcBorders>
+              <w:top w:val="single" w:color="A6A6A6" w:sz="4"/>
+              <w:left w:val="single" w:color="A6A6A6" w:sz="4"/>
+              <w:bottom w:val="single" w:color="A6A6A6" w:sz="4"/>
+              <w:right w:val="single" w:color="A6A6A6" w:sz="4"/>
+            </w:tcBorders>
+            <w:tcMar>
+              <w:top w:type="dxa" w:w="90"/>
+              <w:left w:type="dxa" w:w="100"/>
+              <w:bottom w:type="dxa" w:w="90"/>
+              <w:right w:type="dxa" w:w="100"/>
+            </w:tcMar>
+            <w:vAlign w:val="center"/>
+          </w:tcPr>
+          <w:p>
+            <w:pPr>
+              <w:spacing w:after="0"/>
+            </w:pPr>
+            <w:r>
+              <w:t xml:space="preserve">TX_COUNT</w:t>
+            </w:r>
+          </w:p>
+        </w:tc>
+        <w:tc>
+          <w:tcPr>
+            <w:tcW w:type="dxa" w:w="995"/>
+            <w:tcBorders>
+              <w:top w:val="single" w:color="A6A6A6" w:sz="4"/>
+              <w:left w:val="single" w:color="A6A6A6" w:sz="4"/>
+              <w:bottom w:val="single" w:color="A6A6A6" w:sz="4"/>
+              <w:right w:val="single" w:color="A6A6A6" w:sz="4"/>
+            </w:tcBorders>
+            <w:tcMar>
+              <w:top w:type="dxa" w:w="90"/>
+              <w:left w:type="dxa" w:w="100"/>
+              <w:bottom w:type="dxa" w:w="90"/>
+              <w:right w:type="dxa" w:w="100"/>
+            </w:tcMar>
+            <w:vAlign w:val="center"/>
+          </w:tcPr>
+          <w:p>
+            <w:pPr>
+              <w:spacing w:after="0"/>
+            </w:pPr>
+            <w:r>
+              <w:t xml:space="preserve">RO</w:t>
+            </w:r>
+          </w:p>
+        </w:tc>
+        <w:tc>
+          <w:tcPr>
+            <w:tcW w:type="dxa" w:w="6846"/>
+            <w:tcBorders>
+              <w:top w:val="single" w:color="A6A6A6" w:sz="4"/>
+              <w:left w:val="single" w:color="A6A6A6" w:sz="4"/>
+              <w:bottom w:val="single" w:color="A6A6A6" w:sz="4"/>
+              <w:right w:val="single" w:color="A6A6A6" w:sz="4"/>
+            </w:tcBorders>
+            <w:tcMar>
+              <w:top w:type="dxa" w:w="90"/>
+              <w:left w:type="dxa" w:w="100"/>
+              <w:bottom w:type="dxa" w:w="90"/>
+              <w:right w:type="dxa" w:w="100"/>
+            </w:tcMar>
+            <w:vAlign w:val="center"/>
+          </w:tcPr>
+          <w:p>
+            <w:pPr>
+              <w:spacing w:after="0"/>
+            </w:pPr>
+            <w:r>
+              <w:t xml:space="preserve">Flits pushed</w:t>
+            </w:r>
+          </w:p>
+        </w:tc>
+      </w:tr>
+      <w:tr>
+        <w:trPr>
+          <w:cantSplit/>
+          <w:tblHeader w:val="false"/>
+        </w:trPr>
+        <w:tc>
+          <w:tcPr>
+            <w:tcW w:type="dxa" w:w="995"/>
+            <w:tcBorders>
+              <w:top w:val="single" w:color="A6A6A6" w:sz="4"/>
+              <w:left w:val="single" w:color="A6A6A6" w:sz="4"/>
+              <w:bottom w:val="single" w:color="A6A6A6" w:sz="4"/>
+              <w:right w:val="single" w:color="A6A6A6" w:sz="4"/>
+            </w:tcBorders>
+            <w:tcMar>
+              <w:top w:type="dxa" w:w="90"/>
+              <w:left w:type="dxa" w:w="100"/>
+              <w:bottom w:type="dxa" w:w="90"/>
+              <w:right w:type="dxa" w:w="100"/>
+            </w:tcMar>
+            <w:vAlign w:val="center"/>
+          </w:tcPr>
+          <w:p>
+            <w:pPr>
+              <w:spacing w:after="0"/>
+            </w:pPr>
+            <w:r>
+              <w:t xml:space="preserve">0x24</w:t>
+            </w:r>
+          </w:p>
+        </w:tc>
+        <w:tc>
+          <w:tcPr>
+            <w:tcW w:type="dxa" w:w="1244"/>
+            <w:tcBorders>
+              <w:top w:val="single" w:color="A6A6A6" w:sz="4"/>
+              <w:left w:val="single" w:color="A6A6A6" w:sz="4"/>
+              <w:bottom w:val="single" w:color="A6A6A6" w:sz="4"/>
+              <w:right w:val="single" w:color="A6A6A6" w:sz="4"/>
+            </w:tcBorders>
+            <w:tcMar>
+              <w:top w:type="dxa" w:w="90"/>
+              <w:left w:type="dxa" w:w="100"/>
+              <w:bottom w:type="dxa" w:w="90"/>
+              <w:right w:type="dxa" w:w="100"/>
+            </w:tcMar>
+            <w:vAlign w:val="center"/>
+          </w:tcPr>
+          <w:p>
+            <w:pPr>
+              <w:spacing w:after="0"/>
+            </w:pPr>
+            <w:r>
+              <w:t xml:space="preserve">RX_COUNT</w:t>
+            </w:r>
+          </w:p>
+        </w:tc>
+        <w:tc>
+          <w:tcPr>
+            <w:tcW w:type="dxa" w:w="995"/>
+            <w:tcBorders>
+              <w:top w:val="single" w:color="A6A6A6" w:sz="4"/>
+              <w:left w:val="single" w:color="A6A6A6" w:sz="4"/>
+              <w:bottom w:val="single" w:color="A6A6A6" w:sz="4"/>
+              <w:right w:val="single" w:color="A6A6A6" w:sz="4"/>
+            </w:tcBorders>
+            <w:tcMar>
+              <w:top w:type="dxa" w:w="90"/>
+              <w:left w:type="dxa" w:w="100"/>
+              <w:bottom w:type="dxa" w:w="90"/>
+              <w:right w:type="dxa" w:w="100"/>
+            </w:tcMar>
+            <w:vAlign w:val="center"/>
+          </w:tcPr>
+          <w:p>
+            <w:pPr>
+              <w:spacing w:after="0"/>
+            </w:pPr>
+            <w:r>
+              <w:t xml:space="preserve">RO</w:t>
+            </w:r>
+          </w:p>
+        </w:tc>
+        <w:tc>
+          <w:tcPr>
+            <w:tcW w:type="dxa" w:w="6846"/>
+            <w:tcBorders>
+              <w:top w:val="single" w:color="A6A6A6" w:sz="4"/>
+              <w:left w:val="single" w:color="A6A6A6" w:sz="4"/>
+              <w:bottom w:val="single" w:color="A6A6A6" w:sz="4"/>
+              <w:right w:val="single" w:color="A6A6A6" w:sz="4"/>
+            </w:tcBorders>
+            <w:tcMar>
+              <w:top w:type="dxa" w:w="90"/>
+              <w:left w:type="dxa" w:w="100"/>
+              <w:bottom w:type="dxa" w:w="90"/>
+              <w:right w:type="dxa" w:w="100"/>
+            </w:tcMar>
+            <w:vAlign w:val="center"/>
+          </w:tcPr>
+          <w:p>
+            <w:pPr>
+              <w:spacing w:after="0"/>
+            </w:pPr>
+            <w:r>
+              <w:t xml:space="preserve">Flits popped</w:t>
+            </w:r>
+          </w:p>
+        </w:tc>
+      </w:tr>
+      <w:tr>
+        <w:trPr>
+          <w:cantSplit/>
+          <w:tblHeader w:val="false"/>
+        </w:trPr>
+        <w:tc>
+          <w:tcPr>
+            <w:tcW w:type="dxa" w:w="995"/>
+            <w:tcBorders>
+              <w:top w:val="single" w:color="A6A6A6" w:sz="4"/>
+              <w:left w:val="single" w:color="A6A6A6" w:sz="4"/>
+              <w:bottom w:val="single" w:color="A6A6A6" w:sz="4"/>
+              <w:right w:val="single" w:color="A6A6A6" w:sz="4"/>
+            </w:tcBorders>
+            <w:tcMar>
+              <w:top w:type="dxa" w:w="90"/>
+              <w:left w:type="dxa" w:w="100"/>
+              <w:bottom w:type="dxa" w:w="90"/>
+              <w:right w:type="dxa" w:w="100"/>
+            </w:tcMar>
+            <w:vAlign w:val="center"/>
+          </w:tcPr>
+          <w:p>
+            <w:pPr>
+              <w:spacing w:after="0"/>
+            </w:pPr>
+            <w:r>
+              <w:t xml:space="preserve">0x28</w:t>
+            </w:r>
+          </w:p>
+        </w:tc>
+        <w:tc>
+          <w:tcPr>
+            <w:tcW w:type="dxa" w:w="1244"/>
+            <w:tcBorders>
+              <w:top w:val="single" w:color="A6A6A6" w:sz="4"/>
+              <w:left w:val="single" w:color="A6A6A6" w:sz="4"/>
+              <w:bottom w:val="single" w:color="A6A6A6" w:sz="4"/>
+              <w:right w:val="single" w:color="A6A6A6" w:sz="4"/>
+            </w:tcBorders>
+            <w:tcMar>
+              <w:top w:type="dxa" w:w="90"/>
+              <w:left w:type="dxa" w:w="100"/>
+              <w:bottom w:type="dxa" w:w="90"/>
+              <w:right w:type="dxa" w:w="100"/>
+            </w:tcMar>
+            <w:vAlign w:val="center"/>
+          </w:tcPr>
+          <w:p>
+            <w:pPr>
+              <w:spacing w:after="0"/>
+            </w:pPr>
+            <w:r>
+              <w:t xml:space="preserve">TX_DROP</w:t>
+            </w:r>
+          </w:p>
+        </w:tc>
+        <w:tc>
+          <w:tcPr>
+            <w:tcW w:type="dxa" w:w="995"/>
+            <w:tcBorders>
+              <w:top w:val="single" w:color="A6A6A6" w:sz="4"/>
+              <w:left w:val="single" w:color="A6A6A6" w:sz="4"/>
+              <w:bottom w:val="single" w:color="A6A6A6" w:sz="4"/>
+              <w:right w:val="single" w:color="A6A6A6" w:sz="4"/>
+            </w:tcBorders>
+            <w:tcMar>
+              <w:top w:type="dxa" w:w="90"/>
+              <w:left w:type="dxa" w:w="100"/>
+              <w:bottom w:type="dxa" w:w="90"/>
+              <w:right w:type="dxa" w:w="100"/>
+            </w:tcMar>
+            <w:vAlign w:val="center"/>
+          </w:tcPr>
+          <w:p>
+            <w:pPr>
+              <w:spacing w:after="0"/>
+            </w:pPr>
+            <w:r>
+              <w:t xml:space="preserve">RO</w:t>
+            </w:r>
+          </w:p>
+        </w:tc>
+        <w:tc>
+          <w:tcPr>
+            <w:tcW w:type="dxa" w:w="6846"/>
+            <w:tcBorders>
+              <w:top w:val="single" w:color="A6A6A6" w:sz="4"/>
+              <w:left w:val="single" w:color="A6A6A6" w:sz="4"/>
+              <w:bottom w:val="single" w:color="A6A6A6" w:sz="4"/>
+              <w:right w:val="single" w:color="A6A6A6" w:sz="4"/>
+            </w:tcBorders>
+            <w:tcMar>
+              <w:top w:type="dxa" w:w="90"/>
+              <w:left w:type="dxa" w:w="100"/>
+              <w:bottom w:type="dxa" w:w="90"/>
+              <w:right w:type="dxa" w:w="100"/>
+            </w:tcMar>
+            <w:vAlign w:val="center"/>
+          </w:tcPr>
+          <w:p>
+            <w:pPr>
+              <w:spacing w:after="0"/>
+            </w:pPr>
+            <w:r>
+              <w:t xml:space="preserve">Pushes rejected because the TX FIFO was full</w:t>
+            </w:r>
+          </w:p>
+        </w:tc>
+      </w:tr>
+    </w:tbl>
+    <w:p>
+      <w:pPr>
+        <w:spacing w:after="20"/>
+      </w:pPr>
+    </w:p>
+    <w:p>
+      <w:pPr>
+        <w:spacing w:after="120"/>
+      </w:pPr>
+      <w:r>
+        <w:t xml:space="preserve">A flit costs three bus accesses each way. This is intentionally the slowest path: it proves correctness before the network exists and sets the baseline that AXI-DMA (N7) is measured against.</w:t>
+      </w:r>
+    </w:p>
+    <w:p>
+      <w:pPr>
+        <w:spacing w:after="120"/>
+      </w:pPr>
+      <w:r>
+        <w:rPr>
+          <w:b/>
+          <w:bCs/>
+        </w:rPr>
+        <w:t xml:space="preserve">Clock.</w:t>
+      </w:r>
+      <w:r>
+        <w:t xml:space="preserve"> The PS supplies FCLK_CLK0. The PS derives it by integer division from the IO PLL, so exactly 70 MHz is unavailable; 66.67 MHz is requested, below the fabric's 73.6 MHz ceiling with margin. 71.4 MHz would leave under 0.5 ns.</w:t>
+      </w:r>
+    </w:p>
+    <w:p>
+      <w:pPr>
+        <w:spacing w:after="120"/>
+      </w:pPr>
+      <w:r>
+        <w:rPr>
+          <w:b/>
+          <w:bCs/>
+        </w:rPr>
+        <w:t xml:space="preserve">Verified in simulation</w:t>
+      </w:r>
+      <w:r>
+        <w:t xml:space="preserve"> (</w:t>
+      </w:r>
+      <w:r>
+        <w:rPr>
+          <w:rFonts w:ascii="Consolas" w:cs="Consolas" w:eastAsia="Consolas" w:hAnsi="Consolas"/>
+          <w:sz w:val="18"/>
+          <w:szCs w:val="18"/>
+        </w:rPr>
+        <w:t xml:space="preserve">tb/tb_n1_bridge.sv</w:t>
+      </w:r>
+      <w:r>
+        <w:t xml:space="preserve">, </w:t>
+      </w:r>
+      <w:r>
+        <w:rPr>
+          <w:rFonts w:ascii="Consolas" w:cs="Consolas" w:eastAsia="Consolas" w:hAnsi="Consolas"/>
+          <w:sz w:val="18"/>
+          <w:szCs w:val="18"/>
+        </w:rPr>
+        <w:t xml:space="preserve">make n1</w:t>
+      </w:r>
+      <w:r>
+        <w:t xml:space="preserve">): ID register; DATA loopback with SRC_ID stamping; memory write and four-word read-back; an E_ALIGN error response; flit counters; generators error-free throughout, with randomized receive backpressure enabled.</w:t>
+      </w:r>
+    </w:p>
+    <w:p>
+      <w:pPr>
+        <w:pStyle w:val="Heading1"/>
+      </w:pPr>
+      <w:r>
+        <w:t xml:space="preserve">26. Open Decisions</w:t>
       </w:r>
     </w:p>
     <w:p>

</xml_diff>